<commit_message>
updating docs for final project and hub
</commit_message>
<xml_diff>
--- a/assets/documents/26-udenar-big-data/project-report-template.docx
+++ b/assets/documents/26-udenar-big-data/project-report-template.docx
@@ -57,7 +57,7 @@
         <w:rPr>
           <w:b w:val="0"/>
         </w:rPr>
-        <w:t>Interesados, requerimientos, objetivos, subconjunto GEIH. Incluya el **canvas** (imagen) y liste los **requisitos de ética y gobernanza** (p. ej. k-anon, no publicar microdatos, bitácora, contrato de esquema, capas de evidencia).</w:t>
+        <w:t>Interesados, requerimientos, objetivos, conjunto de datos. Incluya el **canvas** (imagen), describalo y liste los requerimientos del proyecto incluyendo los aspectos éticos y de gobernanza.</w:t>
       </w:r>
     </w:p>
     <w:p/>
@@ -85,7 +85,7 @@
         <w:rPr>
           <w:b w:val="0"/>
         </w:rPr>
-        <w:t>Figura y narrativa del recorrido completo (fuentes → almacenamiento → procesamiento → ingesta → analítica → decisión). Indique qué etapas implementaron en los cuadernos del curso.</w:t>
+        <w:t>Figura y narrativa del recorrido completo (fuentes → almacenamiento → procesamiento → ingesta → analítica → decisión). Indique como se implementaron las diferentes etapas y como dicha implementación cumple con los requerimientos del proyecto.</w:t>
       </w:r>
     </w:p>
     <w:p/>
@@ -102,7 +102,7 @@
         <w:rPr>
           <w:b w:val="0"/>
         </w:rPr>
-        <w:t>Diagrama y explicación: harmonización, partición del lakehouse, ingesta gobernada (Prefect, audit.jsonl, schema_contract.json) y capa curated/analítica.</w:t>
+        <w:t>Diagrama y explicación: harmonización, partición del lakehouse, ingesta gobernada y herramientas utilizadas.</w:t>
       </w:r>
     </w:p>
     <w:p/>
@@ -130,7 +130,7 @@
         <w:rPr>
           <w:b w:val="0"/>
         </w:rPr>
-        <w:t>Modelos, métricas, gráficos/tablero; qué apoyan o no la decisión. Solo agregados oficiales para inferencia sobre GEIH.</w:t>
+        <w:t>Modelos, métricas, gráficos/tablero; qué apoyan o no la decisión. Indique como se implementaron los modelos y como dicha implementación cumple con los requerimientos del proyecto.</w:t>
       </w:r>
     </w:p>
     <w:p/>
@@ -139,24 +139,7 @@
         <w:pStyle w:val="Heading2"/>
       </w:pPr>
       <w:r>
-        <w:t>6. Cumplimiento de requisitos éticos y de gobernanza</w:t>
-      </w:r>
-    </w:p>
-    <w:p>
-      <w:r>
-        <w:rPr>
-          <w:b w:val="0"/>
-        </w:rPr>
-        <w:t>Explique **cómo** el pipeline y la analítica satisfacen cada requisito listado en la sección 2. No repita la lista — trace la implementación.</w:t>
-      </w:r>
-    </w:p>
-    <w:p/>
-    <w:p>
-      <w:pPr>
-        <w:pStyle w:val="Heading2"/>
-      </w:pPr>
-      <w:r>
-        <w:t>7. Limitaciones y recomendación</w:t>
+        <w:t>6. Limitaciones y recomendación</w:t>
       </w:r>
     </w:p>
     <w:p>
@@ -173,7 +156,7 @@
         <w:pStyle w:val="Heading2"/>
       </w:pPr>
       <w:r>
-        <w:t>8. Contribución del grupo y uso de IA</w:t>
+        <w:t>7. Contribución del grupo y uso de IA</w:t>
       </w:r>
     </w:p>
     <w:p>

</xml_diff>

<commit_message>
updating project template and lecture 5 and 6
</commit_message>
<xml_diff>
--- a/assets/documents/26-udenar-big-data/project-report-template.docx
+++ b/assets/documents/26-udenar-big-data/project-report-template.docx
@@ -39,7 +39,105 @@
         <w:rPr>
           <w:lang w:val="es-CO"/>
         </w:rPr>
-        <w:t xml:space="preserve">Consolide el trabajo de las semanas 1–3 (puede reutilizar texto e imágenes de project_requirements y data_architecture). Exporte a PDF como project-report-&lt;group_id&gt;.pdf e inclúyalo en el ZIP project-&lt;group_id&gt;.zip. Plazo del ZIP: martes 30 de junio de 2026, 23:59 (Colombia). Extensión orientativa del cuerpo (secciones 1–7): </w:t>
+        <w:t xml:space="preserve">Consolide el trabajo de las semanas 1–3 (puede reutilizar texto e imágenes de </w:t>
+      </w:r>
+      <w:proofErr w:type="spellStart"/>
+      <w:r>
+        <w:rPr>
+          <w:lang w:val="es-CO"/>
+        </w:rPr>
+        <w:t>project_requirements</w:t>
+      </w:r>
+      <w:proofErr w:type="spellEnd"/>
+      <w:r>
+        <w:rPr>
+          <w:lang w:val="es-CO"/>
+        </w:rPr>
+        <w:t xml:space="preserve"> y </w:t>
+      </w:r>
+      <w:proofErr w:type="spellStart"/>
+      <w:r>
+        <w:rPr>
+          <w:lang w:val="es-CO"/>
+        </w:rPr>
+        <w:t>data_architecture</w:t>
+      </w:r>
+      <w:proofErr w:type="spellEnd"/>
+      <w:r>
+        <w:rPr>
+          <w:lang w:val="es-CO"/>
+        </w:rPr>
+        <w:t xml:space="preserve">). Exporte a PDF como </w:t>
+      </w:r>
+      <w:proofErr w:type="spellStart"/>
+      <w:r>
+        <w:rPr>
+          <w:lang w:val="es-CO"/>
+        </w:rPr>
+        <w:t>project-report</w:t>
+      </w:r>
+      <w:proofErr w:type="spellEnd"/>
+      <w:r>
+        <w:rPr>
+          <w:lang w:val="es-CO"/>
+        </w:rPr>
+        <w:t>-&lt;</w:t>
+      </w:r>
+      <w:proofErr w:type="spellStart"/>
+      <w:r>
+        <w:rPr>
+          <w:lang w:val="es-CO"/>
+        </w:rPr>
+        <w:t>group_id</w:t>
+      </w:r>
+      <w:proofErr w:type="spellEnd"/>
+      <w:r>
+        <w:rPr>
+          <w:lang w:val="es-CO"/>
+        </w:rPr>
+        <w:t>&gt;.</w:t>
+      </w:r>
+      <w:proofErr w:type="spellStart"/>
+      <w:r>
+        <w:rPr>
+          <w:lang w:val="es-CO"/>
+        </w:rPr>
+        <w:t>pdf</w:t>
+      </w:r>
+      <w:proofErr w:type="spellEnd"/>
+      <w:r>
+        <w:rPr>
+          <w:lang w:val="es-CO"/>
+        </w:rPr>
+        <w:t xml:space="preserve"> e inclúyalo en el ZIP </w:t>
+      </w:r>
+      <w:proofErr w:type="spellStart"/>
+      <w:r>
+        <w:rPr>
+          <w:lang w:val="es-CO"/>
+        </w:rPr>
+        <w:t>project</w:t>
+      </w:r>
+      <w:proofErr w:type="spellEnd"/>
+      <w:r>
+        <w:rPr>
+          <w:lang w:val="es-CO"/>
+        </w:rPr>
+        <w:t>-&lt;</w:t>
+      </w:r>
+      <w:proofErr w:type="spellStart"/>
+      <w:r>
+        <w:rPr>
+          <w:lang w:val="es-CO"/>
+        </w:rPr>
+        <w:t>group_id</w:t>
+      </w:r>
+      <w:proofErr w:type="spellEnd"/>
+      <w:r>
+        <w:rPr>
+          <w:lang w:val="es-CO"/>
+        </w:rPr>
+        <w:t xml:space="preserve">&gt;.zip. Plazo del ZIP: martes 30 de junio de 2026, 23:59 (Colombia). Extensión orientativa del cuerpo (secciones 1–7): </w:t>
       </w:r>
       <w:r>
         <w:rPr>
@@ -75,7 +173,29 @@
         <w:rPr>
           <w:lang w:val="es-CO"/>
         </w:rPr>
-        <w:t>00 palabras (sin contar figuras, canvas, diagramas ni tablas). Mantenga los títulos de sección exactamente como aparecen abajo.</w:t>
+        <w:t xml:space="preserve">00 palabras (sin contar figuras, </w:t>
+      </w:r>
+      <w:proofErr w:type="spellStart"/>
+      <w:r>
+        <w:rPr>
+          <w:lang w:val="es-CO"/>
+        </w:rPr>
+        <w:t>canvas</w:t>
+      </w:r>
+      <w:proofErr w:type="spellEnd"/>
+      <w:r>
+        <w:rPr>
+          <w:lang w:val="es-CO"/>
+        </w:rPr>
+        <w:t xml:space="preserve">, diagramas ni tablas). </w:t>
+      </w:r>
+      <w:r>
+        <w:rPr>
+          <w:b/>
+          <w:bCs/>
+          <w:lang w:val="es-CO"/>
+        </w:rPr>
+        <w:t>Puede borrar este párrafo pero mantenga los títulos de sección exactamente como aparecen abajo.</w:t>
       </w:r>
     </w:p>
     <w:p>
@@ -130,8 +250,16 @@
         <w:rPr>
           <w:lang w:val="es-CO"/>
         </w:rPr>
-        <w:t>2. Requerimientos del proyecto y modelo canvas</w:t>
+        <w:t xml:space="preserve">2. Requerimientos del proyecto y modelo </w:t>
       </w:r>
+      <w:proofErr w:type="spellStart"/>
+      <w:r>
+        <w:rPr>
+          <w:lang w:val="es-CO"/>
+        </w:rPr>
+        <w:t>canvas</w:t>
+      </w:r>
+      <w:proofErr w:type="spellEnd"/>
     </w:p>
     <w:p>
       <w:pPr>
@@ -143,7 +271,35 @@
         <w:rPr>
           <w:lang w:val="es-CO"/>
         </w:rPr>
-        <w:t>Interesados, requerimientos, objetivos, conjunto de datos. Incluya el **canvas** (imagen), describalo y liste los requerimientos del proyecto incluyendo los aspectos éticos y de gobernanza.</w:t>
+        <w:t>Interesados, requerimientos, objetivos, conjunto de datos. Incluya el **</w:t>
+      </w:r>
+      <w:proofErr w:type="spellStart"/>
+      <w:r>
+        <w:rPr>
+          <w:lang w:val="es-CO"/>
+        </w:rPr>
+        <w:t>canvas</w:t>
+      </w:r>
+      <w:proofErr w:type="spellEnd"/>
+      <w:r>
+        <w:rPr>
+          <w:lang w:val="es-CO"/>
+        </w:rPr>
+        <w:t xml:space="preserve">** (imagen), </w:t>
+      </w:r>
+      <w:proofErr w:type="spellStart"/>
+      <w:r>
+        <w:rPr>
+          <w:lang w:val="es-CO"/>
+        </w:rPr>
+        <w:t>describalo</w:t>
+      </w:r>
+      <w:proofErr w:type="spellEnd"/>
+      <w:r>
+        <w:rPr>
+          <w:lang w:val="es-CO"/>
+        </w:rPr>
+        <w:t xml:space="preserve"> y liste los requerimientos del proyecto incluyendo los aspectos éticos y de gobernanza.</w:t>
       </w:r>
     </w:p>
     <w:p>
@@ -163,7 +319,21 @@
         <w:rPr>
           <w:lang w:val="es-CO"/>
         </w:rPr>
-        <w:t>[Espacio para pegar el canvas — inserte imagen en Word]</w:t>
+        <w:t xml:space="preserve">[Espacio para pegar el </w:t>
+      </w:r>
+      <w:proofErr w:type="spellStart"/>
+      <w:r>
+        <w:rPr>
+          <w:lang w:val="es-CO"/>
+        </w:rPr>
+        <w:t>canvas</w:t>
+      </w:r>
+      <w:proofErr w:type="spellEnd"/>
+      <w:r>
+        <w:rPr>
+          <w:lang w:val="es-CO"/>
+        </w:rPr>
+        <w:t xml:space="preserve"> — inserte imagen en Word]</w:t>
       </w:r>
     </w:p>
     <w:p>
@@ -198,7 +368,21 @@
         <w:rPr>
           <w:lang w:val="es-CO"/>
         </w:rPr>
-        <w:t>3. Pipeline de big data</w:t>
+        <w:t xml:space="preserve">3. Pipeline de </w:t>
+      </w:r>
+      <w:proofErr w:type="spellStart"/>
+      <w:r>
+        <w:rPr>
+          <w:lang w:val="es-CO"/>
+        </w:rPr>
+        <w:t>big</w:t>
+      </w:r>
+      <w:proofErr w:type="spellEnd"/>
+      <w:r>
+        <w:rPr>
+          <w:lang w:val="es-CO"/>
+        </w:rPr>
+        <w:t xml:space="preserve"> data</w:t>
       </w:r>
     </w:p>
     <w:p>
@@ -245,7 +429,21 @@
         <w:rPr>
           <w:lang w:val="es-CO"/>
         </w:rPr>
-        <w:t>Diagrama y explicación: harmonización, partición del lakehouse, ingesta gobernada y herramientas utilizadas.</w:t>
+        <w:t xml:space="preserve">Diagrama y explicación: harmonización, partición del </w:t>
+      </w:r>
+      <w:proofErr w:type="spellStart"/>
+      <w:r>
+        <w:rPr>
+          <w:lang w:val="es-CO"/>
+        </w:rPr>
+        <w:t>lakehouse</w:t>
+      </w:r>
+      <w:proofErr w:type="spellEnd"/>
+      <w:r>
+        <w:rPr>
+          <w:lang w:val="es-CO"/>
+        </w:rPr>
+        <w:t>, ingesta gobernada y herramientas utilizadas.</w:t>
       </w:r>
     </w:p>
     <w:p>
@@ -379,7 +577,55 @@
         <w:t xml:space="preserve">Rol de cada integrante; herramientas de IA usadas en el proyecto y cómo influyeron; declaración de integridad. </w:t>
       </w:r>
       <w:r>
-        <w:t>Si optan por publicación web, confirmen autorización aquí.</w:t>
+        <w:t xml:space="preserve">Si </w:t>
+      </w:r>
+      <w:proofErr w:type="spellStart"/>
+      <w:r>
+        <w:t>optan</w:t>
+      </w:r>
+      <w:proofErr w:type="spellEnd"/>
+      <w:r>
+        <w:t xml:space="preserve"> </w:t>
+      </w:r>
+      <w:proofErr w:type="spellStart"/>
+      <w:r>
+        <w:t>por</w:t>
+      </w:r>
+      <w:proofErr w:type="spellEnd"/>
+      <w:r>
+        <w:t xml:space="preserve"> </w:t>
+      </w:r>
+      <w:proofErr w:type="spellStart"/>
+      <w:r>
+        <w:t>publicación</w:t>
+      </w:r>
+      <w:proofErr w:type="spellEnd"/>
+      <w:r>
+        <w:t xml:space="preserve"> web, </w:t>
+      </w:r>
+      <w:proofErr w:type="spellStart"/>
+      <w:r>
+        <w:t>confirmen</w:t>
+      </w:r>
+      <w:proofErr w:type="spellEnd"/>
+      <w:r>
+        <w:t xml:space="preserve"> </w:t>
+      </w:r>
+      <w:proofErr w:type="spellStart"/>
+      <w:r>
+        <w:t>autorización</w:t>
+      </w:r>
+      <w:proofErr w:type="spellEnd"/>
+      <w:r>
+        <w:t xml:space="preserve"> </w:t>
+      </w:r>
+      <w:proofErr w:type="spellStart"/>
+      <w:r>
+        <w:t>aquí</w:t>
+      </w:r>
+      <w:proofErr w:type="spellEnd"/>
+      <w:r>
+        <w:t>.</w:t>
       </w:r>
     </w:p>
     <w:p/>

</xml_diff>